<commit_message>
docs: aggiorna PDF/DOCX della proposta editing UI (rev. filiera completa)
Allinea gli export scaricabili all’HTML con passi GUIDATA e BL-UI-04 chiuso.

Co-authored-by: Renato <renatizzi@users.noreply.github.com>
</commit_message>
<xml_diff>
--- a/docs/export/PVM_Proposta_Editing_UI_Template_TOBE.docx
+++ b/docs/export/PVM_Proposta_Editing_UI_Template_TOBE.docx
@@ -7,17 +7,17 @@
         <w:pStyle w:val="Title"/>
       </w:pPr>
       <w:r>
-        <w:t>MediaManager — Proposta editing UI TO-BE + filiera Setup</w:t>
+        <w:t>MediaManager — Proposta editing UI TO-BE + filiera Setup (rev. 30/10)</w:t>
       </w:r>
     </w:p>
     <w:p>
       <w:r>
-        <w:t>Chiusure Renato 28/10/2026 (Europe/Rome). Nessuna modifica al codice app.</w:t>
+        <w:t>Aggiornamento: GUIDATA PC passi 1–4 espansi; scheda CIFS completa; NAS/Sorgenti arricchiti; BL-UI-04 chiuso (Nome Catalogo dopo Dove tenere). Nessun codice app.</w:t>
       </w:r>
     </w:p>
     <w:p>
       <w:r>
-        <w:t>Aprire PVM_Proposta_Editing_UI_Template_TOBE.html o .pdf per i mock grafici pagina per pagina (Parte 1 slide 2–9 + Parte 2 filiere Catalogo/Sorgenti).</w:t>
+        <w:t>Aprire PVM_Proposta_Editing_UI_Template_TOBE.html o .pdf per i mock.</w:t>
       </w:r>
     </w:p>
     <w:p>
@@ -25,57 +25,55 @@
         <w:pStyle w:val="Heading1"/>
       </w:pPr>
       <w:r>
-        <w:t>Decisioni 1–10</w:t>
+        <w:t>Sequenza comune Setup Catalogo</w:t>
       </w:r>
     </w:p>
     <w:p>
+      <w:pPr>
+        <w:pStyle w:val="ListNumber"/>
+      </w:pPr>
       <w:r>
-        <w:t>1 Riga Posizione solo dove ha senso (non hub); formato Nome Catalogo + dispositivo + percorso + stato; altrimenti messaggio crea.</w:t>
+        <w:t>Inizio</w:t>
       </w:r>
     </w:p>
     <w:p>
+      <w:pPr>
+        <w:pStyle w:val="ListNumber"/>
+      </w:pPr>
       <w:r>
-        <w:t>2 Stato Online/Offline/Non verificabile (Workflow).</w:t>
+        <w:t>Dove tenere il Catalogo</w:t>
       </w:r>
     </w:p>
     <w:p>
+      <w:pPr>
+        <w:pStyle w:val="ListNumber"/>
+      </w:pPr>
       <w:r>
-        <w:t>3 Nome Catalogo = nome scelto in creazione (es. Vacanza a Parigi).</w:t>
+        <w:t>Nome del Catalogo</w:t>
       </w:r>
     </w:p>
     <w:p>
+      <w:pPr>
+        <w:pStyle w:val="ListNumber"/>
+      </w:pPr>
       <w:r>
-        <w:t>4 Acquisisci: solo icona aggiorna; elimina Tutti; senza Catalogo solo invito senza bottoni inutili.</w:t>
+        <w:t>Ramo dispositivo</w:t>
       </w:r>
     </w:p>
     <w:p>
+      <w:pPr>
+        <w:pStyle w:val="ListNumber"/>
+      </w:pPr>
       <w:r>
-        <w:t>5 Componi ALBUM/RACCOLTA switch + plus contestuale: praticabile e migliore — adottato nei template.</w:t>
+        <w:t>Riepilogo/verifica</w:t>
       </w:r>
     </w:p>
     <w:p>
+      <w:pPr>
+        <w:pStyle w:val="ListNumber"/>
+      </w:pPr>
       <w:r>
-        <w:t>6 Configura riorganizzazione sospesa.</w:t>
-      </w:r>
-    </w:p>
-    <w:p>
-      <w:r>
-        <w:t>7 Parte 1 = slide 2–9.</w:t>
-      </w:r>
-    </w:p>
-    <w:p>
-      <w:r>
-        <w:t>8 Solo Host manuale; scan LAN in backlog.</w:t>
-      </w:r>
-    </w:p>
-    <w:p>
-      <w:r>
-        <w:t>9 Template = mock pagina/dialogo effettivo.</w:t>
-      </w:r>
-    </w:p>
-    <w:p>
-      <w:r>
-        <w:t>10 PC Windows-centrico ora; macOS/Linux in backlog.</w:t>
+        <w:t>Esito</w:t>
       </w:r>
     </w:p>
     <w:p>
@@ -83,7 +81,7 @@
         <w:pStyle w:val="Heading1"/>
       </w:pPr>
       <w:r>
-        <w:t>Backlog</w:t>
+        <w:t>Backlog residuo</w:t>
       </w:r>
     </w:p>
     <w:p>
@@ -91,7 +89,7 @@
         <w:pStyle w:val="ListBullet"/>
       </w:pPr>
       <w:r>
-        <w:t>BL-UI-01 Scan LAN / rilevamento IP</w:t>
+        <w:t>BL-UI-01 Scan LAN</w:t>
       </w:r>
     </w:p>
     <w:p>
@@ -99,7 +97,7 @@
         <w:pStyle w:val="ListBullet"/>
       </w:pPr>
       <w:r>
-        <w:t>BL-UI-02 Guide PC macOS/Linux</w:t>
+        <w:t>BL-UI-02 macOS/Linux</w:t>
       </w:r>
     </w:p>
     <w:p>
@@ -107,7 +105,7 @@
         <w:pStyle w:val="ListBullet"/>
       </w:pPr>
       <w:r>
-        <w:t>BL-UI-03 Riorganizzazione Configura</w:t>
+        <w:t>BL-UI-03 Configura</w:t>
       </w:r>
     </w:p>
     <w:p>
@@ -115,15 +113,7 @@
         <w:pStyle w:val="ListBullet"/>
       </w:pPr>
       <w:r>
-        <w:t>BL-UI-04 Posizione passo Nome Catalogo</w:t>
-      </w:r>
-    </w:p>
-    <w:p>
-      <w:pPr>
-        <w:pStyle w:val="ListBullet"/>
-      </w:pPr>
-      <w:r>
-        <w:t>BL-UI-05 Fattibilità SMB integrato / CIFS da terza app</w:t>
+        <w:t>BL-UI-05 SMB/CIFS terza app</w:t>
       </w:r>
     </w:p>
     <w:sectPr>

</xml_diff>

<commit_message>
docs: recepisce integrazione_template.pdf nei TO-BE (chrome + filiere)
Applica stile, landing Avvio procedura, locale/PC/NAS/Sorgenti; propone RAPIDA mancante; elenca incongruenze. Nessun codice app.

Co-authored-by: Renato <renatizzi@users.noreply.github.com>
</commit_message>
<xml_diff>
--- a/docs/export/PVM_Proposta_Editing_UI_Template_TOBE.docx
+++ b/docs/export/PVM_Proposta_Editing_UI_Template_TOBE.docx
@@ -7,17 +7,12 @@
         <w:pStyle w:val="Title"/>
       </w:pPr>
       <w:r>
-        <w:t>MediaManager — Proposta editing UI TO-BE + filiera Setup (rev. 30/10)</w:t>
+        <w:t>MediaManager — Template TO-BE (recepimento integrazione 30/10)</w:t>
       </w:r>
     </w:p>
     <w:p>
       <w:r>
-        <w:t>Aggiornamento: GUIDATA PC passi 1–4 espansi; scheda CIFS completa; NAS/Sorgenti arricchiti; BL-UI-04 chiuso (Nome Catalogo dopo Dove tenere). Nessun codice app.</w:t>
-      </w:r>
-    </w:p>
-    <w:p>
-      <w:r>
-        <w:t>Aprire PVM_Proposta_Editing_UI_Template_TOBE.html o .pdf per i mock.</w:t>
+        <w:t>Fonte: integrazione_template.pdf. Nessun codice app. Aprire HTML/PDF omonimi per i mock grafici.</w:t>
       </w:r>
     </w:p>
     <w:p>
@@ -25,7 +20,7 @@
         <w:pStyle w:val="Heading1"/>
       </w:pPr>
       <w:r>
-        <w:t>Sequenza comune Setup Catalogo</w:t>
+        <w:t>Incongruenze segnalate</w:t>
       </w:r>
     </w:p>
     <w:p>
@@ -33,7 +28,7 @@
         <w:pStyle w:val="ListNumber"/>
       </w:pPr>
       <w:r>
-        <w:t>Inizio</w:t>
+        <w:t>Sorgenti: PDF dice «cartella del Catalogo» → corretto in «cartella da censire».</w:t>
       </w:r>
     </w:p>
     <w:p>
@@ -41,7 +36,7 @@
         <w:pStyle w:val="ListNumber"/>
       </w:pPr>
       <w:r>
-        <w:t>Dove tenere il Catalogo</w:t>
+        <w:t>Cloud: ipotesi SAF senza Aggiungi account; serve chiarimento se diverso.</w:t>
       </w:r>
     </w:p>
     <w:p>
@@ -49,7 +44,7 @@
         <w:pStyle w:val="ListNumber"/>
       </w:pPr>
       <w:r>
-        <w:t>Nome del Catalogo</w:t>
+        <w:t>RAPIDA PC/NAS: proposta in §3 del documento (Host→CIFS→cartella→Salva); in attesa conferma.</w:t>
       </w:r>
     </w:p>
     <w:p>
@@ -57,7 +52,7 @@
         <w:pStyle w:val="ListNumber"/>
       </w:pPr>
       <w:r>
-        <w:t>Ramo dispositivo</w:t>
+        <w:t>Sorgenti senza RAPIDA/GUIDATA in questa revisione (PDF: verificare se opportuno).</w:t>
       </w:r>
     </w:p>
     <w:p>
@@ -65,7 +60,7 @@
         <w:pStyle w:val="ListNumber"/>
       </w:pPr>
       <w:r>
-        <w:t>Riepilogo/verifica</w:t>
+        <w:t>Esc presente nei mock ma nel PDF era «valuterei» — conferma se vincolante.</w:t>
       </w:r>
     </w:p>
     <w:p>
@@ -73,7 +68,15 @@
         <w:pStyle w:val="ListNumber"/>
       </w:pPr>
       <w:r>
-        <w:t>Esito</w:t>
+        <w:t>Default nome MediaManagerCatalog (niente Vacanza a Parigi).</w:t>
+      </w:r>
+    </w:p>
+    <w:p>
+      <w:pPr>
+        <w:pStyle w:val="ListNumber"/>
+      </w:pPr>
+      <w:r>
+        <w:t>Setup sostituisce sede (niente Imposta/Modifica).</w:t>
       </w:r>
     </w:p>
     <w:p>
@@ -81,7 +84,7 @@
         <w:pStyle w:val="Heading1"/>
       </w:pPr>
       <w:r>
-        <w:t>Backlog residuo</w:t>
+        <w:t>Recepito dal PDF</w:t>
       </w:r>
     </w:p>
     <w:p>
@@ -89,7 +92,7 @@
         <w:pStyle w:val="ListBullet"/>
       </w:pPr>
       <w:r>
-        <w:t>BL-UI-01 Scan LAN</w:t>
+        <w:t>Stile: sottotitolo corsivo; riga Catalogo senza titolo; formati locale vs altri; microfono in ricerca.</w:t>
       </w:r>
     </w:p>
     <w:p>
@@ -97,7 +100,7 @@
         <w:pStyle w:val="ListBullet"/>
       </w:pPr>
       <w:r>
-        <w:t>BL-UI-02 macOS/Linux</w:t>
+        <w:t>Landing Setup Catalogo «Avvio procedura»: nome + dispositivo + modello; riquadri flag; Esc.</w:t>
       </w:r>
     </w:p>
     <w:p>
@@ -105,7 +108,7 @@
         <w:pStyle w:val="ListBullet"/>
       </w:pPr>
       <w:r>
-        <w:t>BL-UI-03 Configura</w:t>
+        <w:t>Locale: una pagina Scelta cartella + Salva (non Salva e verifica) + conferma.</w:t>
       </w:r>
     </w:p>
     <w:p>
@@ -113,7 +116,15 @@
         <w:pStyle w:val="ListBullet"/>
       </w:pPr>
       <w:r>
-        <w:t>BL-UI-05 SMB/CIFS terza app</w:t>
+        <w:t>PC/NAS: combo RAPIDA/GUIDATA default rapida + Avvia; GUIDATA PC 1–4 + CIFS.</w:t>
+      </w:r>
+    </w:p>
+    <w:p>
+      <w:pPr>
+        <w:pStyle w:val="ListBullet"/>
+      </w:pPr>
+      <w:r>
+        <w:t>Sorgenti: landing Setup Sorgenti come da §10 (con correzione testo cartella).</w:t>
       </w:r>
     </w:p>
     <w:sectPr>

</xml_diff>